<commit_message>
fix: resolve test failures from Redis key conflicts and cache json loads TypeError
</commit_message>
<xml_diff>
--- a/docs/final-report/formal-report/cybersim-graduation-report.docx
+++ b/docs/final-report/formal-report/cybersim-graduation-report.docx
@@ -6616,7 +6616,7 @@
       <w:r>
         <w:drawing>
           <wp:inline xmlns:a="http://schemas.openxmlformats.org/drawingml/2006/main" xmlns:pic="http://schemas.openxmlformats.org/drawingml/2006/picture">
-            <wp:extent cx="4860000" cy="2399005"/>
+            <wp:extent cx="4860000" cy="2130128"/>
             <wp:docPr id="1" name="Picture 1"/>
             <wp:cNvGraphicFramePr>
               <a:graphicFrameLocks noChangeAspect="1"/>
@@ -6637,7 +6637,7 @@
                   <pic:spPr>
                     <a:xfrm>
                       <a:off x="0" y="0"/>
-                      <a:ext cx="4860000" cy="2399005"/>
+                      <a:ext cx="4860000" cy="2130128"/>
                     </a:xfrm>
                     <a:prstGeom prst="rect"/>
                   </pic:spPr>
@@ -6700,7 +6700,7 @@
       <w:r>
         <w:drawing>
           <wp:inline xmlns:a="http://schemas.openxmlformats.org/drawingml/2006/main" xmlns:pic="http://schemas.openxmlformats.org/drawingml/2006/picture">
-            <wp:extent cx="4860000" cy="3335051"/>
+            <wp:extent cx="4860000" cy="5003868"/>
             <wp:docPr id="2" name="Picture 2"/>
             <wp:cNvGraphicFramePr>
               <a:graphicFrameLocks noChangeAspect="1"/>
@@ -6721,7 +6721,7 @@
                   <pic:spPr>
                     <a:xfrm>
                       <a:off x="0" y="0"/>
-                      <a:ext cx="4860000" cy="3335051"/>
+                      <a:ext cx="4860000" cy="5003868"/>
                     </a:xfrm>
                     <a:prstGeom prst="rect"/>
                   </pic:spPr>
@@ -7191,7 +7191,7 @@
       <w:r>
         <w:drawing>
           <wp:inline xmlns:a="http://schemas.openxmlformats.org/drawingml/2006/main" xmlns:pic="http://schemas.openxmlformats.org/drawingml/2006/picture">
-            <wp:extent cx="4860000" cy="1252194"/>
+            <wp:extent cx="4860000" cy="2089963"/>
             <wp:docPr id="3" name="Picture 3"/>
             <wp:cNvGraphicFramePr>
               <a:graphicFrameLocks noChangeAspect="1"/>
@@ -7212,7 +7212,7 @@
                   <pic:spPr>
                     <a:xfrm>
                       <a:off x="0" y="0"/>
-                      <a:ext cx="4860000" cy="1252194"/>
+                      <a:ext cx="4860000" cy="2089963"/>
                     </a:xfrm>
                     <a:prstGeom prst="rect"/>
                   </pic:spPr>
@@ -7373,7 +7373,7 @@
       <w:r>
         <w:drawing>
           <wp:inline xmlns:a="http://schemas.openxmlformats.org/drawingml/2006/main" xmlns:pic="http://schemas.openxmlformats.org/drawingml/2006/picture">
-            <wp:extent cx="4860000" cy="2851531"/>
+            <wp:extent cx="4860000" cy="2664846"/>
             <wp:docPr id="4" name="Picture 4"/>
             <wp:cNvGraphicFramePr>
               <a:graphicFrameLocks noChangeAspect="1"/>
@@ -7394,7 +7394,7 @@
                   <pic:spPr>
                     <a:xfrm>
                       <a:off x="0" y="0"/>
-                      <a:ext cx="4860000" cy="2851531"/>
+                      <a:ext cx="4860000" cy="2664846"/>
                     </a:xfrm>
                     <a:prstGeom prst="rect"/>
                   </pic:spPr>
@@ -9619,7 +9619,7 @@
       <w:r>
         <w:drawing>
           <wp:inline xmlns:a="http://schemas.openxmlformats.org/drawingml/2006/main" xmlns:pic="http://schemas.openxmlformats.org/drawingml/2006/picture">
-            <wp:extent cx="4860000" cy="3446633"/>
+            <wp:extent cx="4860000" cy="2617550"/>
             <wp:docPr id="5" name="Picture 5"/>
             <wp:cNvGraphicFramePr>
               <a:graphicFrameLocks noChangeAspect="1"/>
@@ -9640,7 +9640,7 @@
                   <pic:spPr>
                     <a:xfrm>
                       <a:off x="0" y="0"/>
-                      <a:ext cx="4860000" cy="3446633"/>
+                      <a:ext cx="4860000" cy="2617550"/>
                     </a:xfrm>
                     <a:prstGeom prst="rect"/>
                   </pic:spPr>
@@ -9761,7 +9761,7 @@
       <w:r>
         <w:drawing>
           <wp:inline xmlns:a="http://schemas.openxmlformats.org/drawingml/2006/main" xmlns:pic="http://schemas.openxmlformats.org/drawingml/2006/picture">
-            <wp:extent cx="4860000" cy="1239796"/>
+            <wp:extent cx="4860000" cy="2876859"/>
             <wp:docPr id="6" name="Picture 6"/>
             <wp:cNvGraphicFramePr>
               <a:graphicFrameLocks noChangeAspect="1"/>
@@ -9782,7 +9782,7 @@
                   <pic:spPr>
                     <a:xfrm>
                       <a:off x="0" y="0"/>
-                      <a:ext cx="4860000" cy="1239796"/>
+                      <a:ext cx="4860000" cy="2876859"/>
                     </a:xfrm>
                     <a:prstGeom prst="rect"/>
                   </pic:spPr>
@@ -9805,7 +9805,7 @@
           <w:color w:val="445566"/>
           <w:sz w:val="20"/>
         </w:rPr>
-        <w:t>Figure 4.6: Red-to-Blue Event Sequence</w:t>
+        <w:t>Figure 4.6: Red-to-Blue Event Sequence (WebSocket + SIEM Pipeline)</w:t>
       </w:r>
     </w:p>
     <w:p>

</xml_diff>